<commit_message>
docs: add course outcome documents for CO3 and CO4
</commit_message>
<xml_diff>
--- a/docs/22-49590-3-CO4.docx
+++ b/docs/22-49590-3-CO4.docx
@@ -160,25 +160,7 @@
           <w:color w:val="183A63"/>
           <w:sz w:val="32"/>
         </w:rPr>
-        <w:t xml:space="preserve">INDIVIDUAL PROJECT </w:t>
-      </w:r>
-      <w:proofErr w:type="gramStart"/>
-      <w:r>
-        <w:rPr>
-          <w:b/>
-          <w:color w:val="183A63"/>
-          <w:sz w:val="32"/>
-        </w:rPr>
-        <w:t>ASSESSMENT  |</w:t>
-      </w:r>
-      <w:proofErr w:type="gramEnd"/>
-      <w:r>
-        <w:rPr>
-          <w:b/>
-          <w:color w:val="183A63"/>
-          <w:sz w:val="32"/>
-        </w:rPr>
-        <w:t xml:space="preserve">  WEB TECHNOLOGIES</w:t>
+        <w:t>INDIVIDUAL PROJECT ASSESSMENT  |  WEB TECHNOLOGIES</w:t>
       </w:r>
     </w:p>
     <w:p>
@@ -391,7 +373,6 @@
             <w:vAlign w:val="center"/>
           </w:tcPr>
           <w:p>
-            <w:proofErr w:type="gramStart"/>
             <w:r>
               <w:rPr>
                 <w:b/>
@@ -406,16 +387,7 @@
                 <w:color w:val="1F2D3D"/>
                 <w:sz w:val="18"/>
               </w:rPr>
-              <w:t xml:space="preserve">  |</w:t>
-            </w:r>
-            <w:proofErr w:type="gramEnd"/>
-            <w:r>
-              <w:rPr>
-                <w:b/>
-                <w:color w:val="1F2D3D"/>
-                <w:sz w:val="18"/>
-              </w:rPr>
-              <w:t xml:space="preserve">   Section </w:t>
+              <w:t xml:space="preserve">  |   Section </w:t>
             </w:r>
             <w:r>
               <w:rPr>
@@ -481,9 +453,17 @@
             <w:vAlign w:val="center"/>
           </w:tcPr>
           <w:p>
-            <w:r>
-              <w:t>https://github.com/AKIL-01/wbt-summer-2025-2026.git</w:t>
-            </w:r>
+            <w:pPr>
+              <w:spacing w:line="276" w:lineRule="auto"/>
+            </w:pPr>
+            <w:hyperlink r:id="rId11" w:history="1">
+              <w:r>
+                <w:rPr>
+                  <w:rStyle w:val="Hyperlink"/>
+                </w:rPr>
+                <w:t>https://github.com/jaeef/summer-25-26-CampusXP</w:t>
+              </w:r>
+            </w:hyperlink>
           </w:p>
         </w:tc>
       </w:tr>
@@ -538,25 +518,7 @@
                 <w:color w:val="FFFFFF"/>
                 <w:sz w:val="18"/>
               </w:rPr>
-              <w:t>CO4: Coordinate with group members to develop multi-</w:t>
-            </w:r>
-            <w:proofErr w:type="gramStart"/>
-            <w:r>
-              <w:rPr>
-                <w:b/>
-                <w:color w:val="FFFFFF"/>
-                <w:sz w:val="18"/>
-              </w:rPr>
-              <w:t>tier based</w:t>
-            </w:r>
-            <w:proofErr w:type="gramEnd"/>
-            <w:r>
-              <w:rPr>
-                <w:b/>
-                <w:color w:val="FFFFFF"/>
-                <w:sz w:val="18"/>
-              </w:rPr>
-              <w:t xml:space="preserve"> web application</w:t>
+              <w:t>CO4: Coordinate with group members to develop multi-tier based web application</w:t>
             </w:r>
           </w:p>
         </w:tc>
@@ -982,10 +944,10 @@
           <w:noProof/>
         </w:rPr>
         <w:drawing>
-          <wp:inline distT="0" distB="0" distL="0" distR="0" wp14:anchorId="4C558530" wp14:editId="066797CA">
-            <wp:extent cx="7132320" cy="3089275"/>
-            <wp:effectExtent l="0" t="0" r="0" b="0"/>
-            <wp:docPr id="1636439054" name="Picture 1"/>
+          <wp:inline distT="0" distB="0" distL="0" distR="0" wp14:anchorId="4590F7F0" wp14:editId="64976CFC">
+            <wp:extent cx="7132320" cy="4664075"/>
+            <wp:effectExtent l="0" t="0" r="0" b="3175"/>
+            <wp:docPr id="442190114" name="Picture 1"/>
             <wp:cNvGraphicFramePr>
               <a:graphicFrameLocks xmlns:a="http://schemas.openxmlformats.org/drawingml/2006/main" noChangeAspect="1"/>
             </wp:cNvGraphicFramePr>
@@ -993,11 +955,11 @@
               <a:graphicData uri="http://schemas.openxmlformats.org/drawingml/2006/picture">
                 <pic:pic xmlns:pic="http://schemas.openxmlformats.org/drawingml/2006/picture">
                   <pic:nvPicPr>
-                    <pic:cNvPr id="1636439054" name="Picture 1636439054"/>
+                    <pic:cNvPr id="442190114" name=""/>
                     <pic:cNvPicPr/>
                   </pic:nvPicPr>
                   <pic:blipFill>
-                    <a:blip r:embed="rId11"/>
+                    <a:blip r:embed="rId12"/>
                     <a:stretch>
                       <a:fillRect/>
                     </a:stretch>
@@ -1005,7 +967,7 @@
                   <pic:spPr>
                     <a:xfrm>
                       <a:off x="0" y="0"/>
-                      <a:ext cx="7132320" cy="3089275"/>
+                      <a:ext cx="7132320" cy="4664075"/>
                     </a:xfrm>
                     <a:prstGeom prst="rect">
                       <a:avLst/>
@@ -12650,6 +12612,18 @@
       </w:tcPr>
     </w:tblStylePr>
   </w:style>
+  <w:style w:type="character" w:styleId="Hyperlink">
+    <w:name w:val="Hyperlink"/>
+    <w:basedOn w:val="DefaultParagraphFont"/>
+    <w:uiPriority w:val="99"/>
+    <w:semiHidden/>
+    <w:unhideWhenUsed/>
+    <w:rsid w:val="00A10882"/>
+    <w:rPr>
+      <w:color w:val="0000FF" w:themeColor="hyperlink"/>
+      <w:u w:val="single"/>
+    </w:rPr>
+  </w:style>
 </w:styles>
 </file>
 
@@ -12974,6 +12948,30 @@
 </file>
 
 <file path=customXml/item1.xml><?xml version="1.0" encoding="utf-8"?>
+<b:Sources xmlns:b="http://schemas.openxmlformats.org/officeDocument/2006/bibliography" xmlns="http://schemas.openxmlformats.org/officeDocument/2006/bibliography" SelectedStyle="/APA.XSL" StyleName="APA"/>
+</file>
+
+<file path=customXml/item2.xml><?xml version="1.0" encoding="utf-8"?>
+<?mso-contentType ?>
+<FormTemplates xmlns="http://schemas.microsoft.com/sharepoint/v3/contenttype/forms">
+  <Display>DocumentLibraryForm</Display>
+  <Edit>DocumentLibraryForm</Edit>
+  <New>DocumentLibraryForm</New>
+</FormTemplates>
+</file>
+
+<file path=customXml/item3.xml><?xml version="1.0" encoding="utf-8"?>
+<p:properties xmlns:p="http://schemas.microsoft.com/office/2006/metadata/properties" xmlns:xsi="http://www.w3.org/2001/XMLSchema-instance" xmlns:pc="http://schemas.microsoft.com/office/infopath/2007/PartnerControls">
+  <documentManagement>
+    <lcf76f155ced4ddcb4097134ff3c332f xmlns="e89bd651-a027-450b-961b-5fe5ec8507fb">
+      <Terms xmlns="http://schemas.microsoft.com/office/infopath/2007/PartnerControls"/>
+    </lcf76f155ced4ddcb4097134ff3c332f>
+    <TaxCatchAll xmlns="6aca64f0-1a7f-45a9-aeb0-68bfeee3fd7c" xsi:nil="true"/>
+  </documentManagement>
+</p:properties>
+</file>
+
+<file path=customXml/item4.xml><?xml version="1.0" encoding="utf-8"?>
 <ct:contentTypeSchema xmlns:ct="http://schemas.microsoft.com/office/2006/metadata/contentType" xmlns:ma="http://schemas.microsoft.com/office/2006/metadata/properties/metaAttributes" ct:_="" ma:_="" ma:contentTypeName="Document" ma:contentTypeID="0x0101006BA738DD7176B04DB0A7A860E99B23CF" ma:contentTypeVersion="11" ma:contentTypeDescription="Create a new document." ma:contentTypeScope="" ma:versionID="dfb6c7bb58ff17658e232ce9ded4f482">
   <xsd:schema xmlns:xsd="http://www.w3.org/2001/XMLSchema" xmlns:xs="http://www.w3.org/2001/XMLSchema" xmlns:p="http://schemas.microsoft.com/office/2006/metadata/properties" xmlns:ns2="e89bd651-a027-450b-961b-5fe5ec8507fb" xmlns:ns3="6aca64f0-1a7f-45a9-aeb0-68bfeee3fd7c" targetNamespace="http://schemas.microsoft.com/office/2006/metadata/properties" ma:root="true" ma:fieldsID="f4d25b6188bf54fe63b1183e3b4f8ef3" ns2:_="" ns3:_="">
     <xsd:import namespace="e89bd651-a027-450b-961b-5fe5ec8507fb"/>
@@ -13168,31 +13166,34 @@
 </ct:contentTypeSchema>
 </file>
 
-<file path=customXml/item2.xml><?xml version="1.0" encoding="utf-8"?>
-<p:properties xmlns:p="http://schemas.microsoft.com/office/2006/metadata/properties" xmlns:xsi="http://www.w3.org/2001/XMLSchema-instance" xmlns:pc="http://schemas.microsoft.com/office/infopath/2007/PartnerControls">
-  <documentManagement>
-    <lcf76f155ced4ddcb4097134ff3c332f xmlns="e89bd651-a027-450b-961b-5fe5ec8507fb">
-      <Terms xmlns="http://schemas.microsoft.com/office/infopath/2007/PartnerControls"/>
-    </lcf76f155ced4ddcb4097134ff3c332f>
-    <TaxCatchAll xmlns="6aca64f0-1a7f-45a9-aeb0-68bfeee3fd7c" xsi:nil="true"/>
-  </documentManagement>
-</p:properties>
+<file path=customXml/itemProps1.xml><?xml version="1.0" encoding="utf-8"?>
+<ds:datastoreItem xmlns:ds="http://schemas.openxmlformats.org/officeDocument/2006/customXml" ds:itemID="{EF278816-EC6F-A645-907D-7F25AECB1D4A}">
+  <ds:schemaRefs>
+    <ds:schemaRef ds:uri="http://schemas.openxmlformats.org/officeDocument/2006/bibliography"/>
+  </ds:schemaRefs>
+</ds:datastoreItem>
 </file>
 
-<file path=customXml/item3.xml><?xml version="1.0" encoding="utf-8"?>
-<?mso-contentType ?>
-<FormTemplates xmlns="http://schemas.microsoft.com/sharepoint/v3/contenttype/forms">
-  <Display>DocumentLibraryForm</Display>
-  <Edit>DocumentLibraryForm</Edit>
-  <New>DocumentLibraryForm</New>
-</FormTemplates>
+<file path=customXml/itemProps2.xml><?xml version="1.0" encoding="utf-8"?>
+<ds:datastoreItem xmlns:ds="http://schemas.openxmlformats.org/officeDocument/2006/customXml" ds:itemID="{42CA715B-B0C9-4421-8595-4EE8FA27EC8E}">
+  <ds:schemaRefs>
+    <ds:schemaRef ds:uri="http://schemas.microsoft.com/sharepoint/v3/contenttype/forms"/>
+  </ds:schemaRefs>
+</ds:datastoreItem>
 </file>
 
-<file path=customXml/item4.xml><?xml version="1.0" encoding="utf-8"?>
-<b:Sources xmlns:b="http://schemas.openxmlformats.org/officeDocument/2006/bibliography" xmlns="http://schemas.openxmlformats.org/officeDocument/2006/bibliography" SelectedStyle="/APA.XSL" StyleName="APA"/>
+<file path=customXml/itemProps3.xml><?xml version="1.0" encoding="utf-8"?>
+<ds:datastoreItem xmlns:ds="http://schemas.openxmlformats.org/officeDocument/2006/customXml" ds:itemID="{339F985B-7D9C-40AC-A5EF-0196E8BD6536}">
+  <ds:schemaRefs>
+    <ds:schemaRef ds:uri="http://schemas.microsoft.com/office/2006/metadata/properties"/>
+    <ds:schemaRef ds:uri="http://schemas.microsoft.com/office/infopath/2007/PartnerControls"/>
+    <ds:schemaRef ds:uri="e89bd651-a027-450b-961b-5fe5ec8507fb"/>
+    <ds:schemaRef ds:uri="6aca64f0-1a7f-45a9-aeb0-68bfeee3fd7c"/>
+  </ds:schemaRefs>
+</ds:datastoreItem>
 </file>
 
-<file path=customXml/itemProps1.xml><?xml version="1.0" encoding="utf-8"?>
+<file path=customXml/itemProps4.xml><?xml version="1.0" encoding="utf-8"?>
 <ds:datastoreItem xmlns:ds="http://schemas.openxmlformats.org/officeDocument/2006/customXml" ds:itemID="{AF72D709-5149-4147-B4C1-728E2FA9B925}">
   <ds:schemaRefs>
     <ds:schemaRef ds:uri="http://schemas.microsoft.com/office/2006/metadata/contentType"/>
@@ -13209,31 +13210,4 @@
     <ds:schemaRef ds:uri="http://schemas.microsoft.com/internal/obd"/>
   </ds:schemaRefs>
 </ds:datastoreItem>
-</file>
-
-<file path=customXml/itemProps2.xml><?xml version="1.0" encoding="utf-8"?>
-<ds:datastoreItem xmlns:ds="http://schemas.openxmlformats.org/officeDocument/2006/customXml" ds:itemID="{339F985B-7D9C-40AC-A5EF-0196E8BD6536}">
-  <ds:schemaRefs>
-    <ds:schemaRef ds:uri="http://schemas.microsoft.com/office/2006/metadata/properties"/>
-    <ds:schemaRef ds:uri="http://schemas.microsoft.com/office/infopath/2007/PartnerControls"/>
-    <ds:schemaRef ds:uri="e89bd651-a027-450b-961b-5fe5ec8507fb"/>
-    <ds:schemaRef ds:uri="6aca64f0-1a7f-45a9-aeb0-68bfeee3fd7c"/>
-  </ds:schemaRefs>
-</ds:datastoreItem>
-</file>
-
-<file path=customXml/itemProps3.xml><?xml version="1.0" encoding="utf-8"?>
-<ds:datastoreItem xmlns:ds="http://schemas.openxmlformats.org/officeDocument/2006/customXml" ds:itemID="{42CA715B-B0C9-4421-8595-4EE8FA27EC8E}">
-  <ds:schemaRefs>
-    <ds:schemaRef ds:uri="http://schemas.microsoft.com/sharepoint/v3/contenttype/forms"/>
-  </ds:schemaRefs>
-</ds:datastoreItem>
-</file>
-
-<file path=customXml/itemProps4.xml><?xml version="1.0" encoding="utf-8"?>
-<ds:datastoreItem xmlns:ds="http://schemas.openxmlformats.org/officeDocument/2006/customXml" ds:itemID="{EF278816-EC6F-A645-907D-7F25AECB1D4A}">
-  <ds:schemaRefs>
-    <ds:schemaRef ds:uri="http://schemas.openxmlformats.org/officeDocument/2006/bibliography"/>
-  </ds:schemaRefs>
-</ds:datastoreItem>
 </file>
</xml_diff>